<commit_message>
Impugna o comprovante de PIX da inicial como operação de terceiro
O comprovante juntado pelo autor (ID 59a6bef) não envolve a Reclamada: a
operação figura em nome de Willians da Silva Oliveira. O Capítulo II passa a
impugná-lo por esse fundamento — transferência entre pessoas físicas, na qual
a BS não é parte, não prova pagamento de salário nem vínculo — e a distinguir
esse documento do pagamento de R$ 700,00 de 19/05/2026 feito pela empresa.

Inclui campo vermelho para confirmar com o preposto, antes da audiência, se o
Sr. Willians tem alguma relação com a empresa, evitando afirmar em juízo que
é terceiro estranho sem essa checagem.

Co-Authored-By: Claude Opus 5 <noreply@anthropic.com>
Claude-Session: https://claude.ai/code/session_01TSsng7FymPv1LsoyLBwbBS
</commit_message>
<xml_diff>
--- a/pecas/0020407-95.2026.5.04.0384 - ANGEL MIGUEL DAMAS HERRERA/BS x ANGEL MIGUEL DAMAS HERRERA - CONTESTAÇÃO.docx
+++ b/pecas/0020407-95.2026.5.04.0384 - ANGEL MIGUEL DAMAS HERRERA/BS x ANGEL MIGUEL DAMAS HERRERA - CONTESTAÇÃO.docx
@@ -895,35 +895,71 @@
           <w:i w:val="0"/>
           <w:sz w:val="24"/>
         </w:rPr>
-        <w:t>"Comprovante de PIX" (ID 59a6bef)</w:t>
-      </w:r>
-      <w:r>
-        <w:rPr>
-          <w:rFonts w:ascii="Times New Roman" w:hAnsi="Times New Roman" w:cs="Times New Roman"/>
-          <w:b w:val="0"/>
-          <w:i w:val="0"/>
-          <w:sz w:val="24"/>
-        </w:rPr>
-        <w:t xml:space="preserve"> — </w:t>
+        <w:t>"Comprovante de PIX" (ID 59a6bef) — documento que sequer se refere à Reclamada.</w:t>
+      </w:r>
+      <w:r>
+        <w:rPr>
+          <w:rFonts w:ascii="Times New Roman" w:hAnsi="Times New Roman" w:cs="Times New Roman"/>
+          <w:b w:val="0"/>
+          <w:i w:val="0"/>
+          <w:sz w:val="24"/>
+        </w:rPr>
+        <w:t xml:space="preserve"> Impugna-se </w:t>
       </w:r>
       <w:r>
         <w:rPr>
           <w:rFonts w:ascii="Times New Roman" w:hAnsi="Times New Roman" w:cs="Times New Roman"/>
           <w:b/>
           <w:i w:val="0"/>
+          <w:sz w:val="24"/>
+        </w:rPr>
+        <w:t>categoricamente</w:t>
+      </w:r>
+      <w:r>
+        <w:rPr>
+          <w:rFonts w:ascii="Times New Roman" w:hAnsi="Times New Roman" w:cs="Times New Roman"/>
+          <w:b w:val="0"/>
+          <w:i w:val="0"/>
+          <w:sz w:val="24"/>
+        </w:rPr>
+        <w:t xml:space="preserve"> o comprovante de transferência juntado com a inicial: </w:t>
+      </w:r>
+      <w:r>
+        <w:rPr>
+          <w:rFonts w:ascii="Times New Roman" w:hAnsi="Times New Roman" w:cs="Times New Roman"/>
+          <w:b/>
+          <w:i w:val="0"/>
+          <w:sz w:val="24"/>
+        </w:rPr>
+        <w:t>a Reclamada não figura na operação</w:t>
+      </w:r>
+      <w:r>
+        <w:rPr>
+          <w:rFonts w:ascii="Times New Roman" w:hAnsi="Times New Roman" w:cs="Times New Roman"/>
+          <w:b w:val="0"/>
+          <w:i w:val="0"/>
+          <w:sz w:val="24"/>
+        </w:rPr>
+        <w:t xml:space="preserve">. O comprovante aponta como </w:t>
+      </w:r>
+      <w:r>
+        <w:rPr>
+          <w:rFonts w:ascii="Times New Roman" w:hAnsi="Times New Roman" w:cs="Times New Roman"/>
+          <w:b w:val="0"/>
+          <w:i w:val="0"/>
           <w:color w:val="FF0000"/>
           <w:sz w:val="24"/>
         </w:rPr>
-        <w:t>[CONFERIR TEOR DO DOCUMENTO: identificar remetente, destinatário, data e valor — e, em especial, se corresponde ao pagamento de R$ 700,00 de 19/05/2026, referente à empreitada]</w:t>
-      </w:r>
-      <w:r>
-        <w:rPr>
-          <w:rFonts w:ascii="Times New Roman" w:hAnsi="Times New Roman" w:cs="Times New Roman"/>
-          <w:b w:val="0"/>
-          <w:i w:val="0"/>
-          <w:sz w:val="24"/>
-        </w:rPr>
-        <w:t xml:space="preserve">. Comprovante isolado de transferência eletrônica </w:t>
+        <w:t>[remetente — CONFERIR NO DOCUMENTO]</w:t>
+      </w:r>
+      <w:r>
+        <w:rPr>
+          <w:rFonts w:ascii="Times New Roman" w:hAnsi="Times New Roman" w:cs="Times New Roman"/>
+          <w:b w:val="0"/>
+          <w:i w:val="0"/>
+          <w:sz w:val="24"/>
+        </w:rPr>
+        <w:t xml:space="preserve"> o Sr. </w:t>
       </w:r>
       <w:r>
         <w:rPr>
@@ -932,88 +968,26 @@
           <w:i w:val="0"/>
           <w:sz w:val="24"/>
         </w:rPr>
-        <w:t>não prova relação de emprego</w:t>
-      </w:r>
-      <w:r>
-        <w:rPr>
-          <w:rFonts w:ascii="Times New Roman" w:hAnsi="Times New Roman" w:cs="Times New Roman"/>
-          <w:b w:val="0"/>
-          <w:i w:val="0"/>
-          <w:sz w:val="24"/>
-        </w:rPr>
-        <w:t xml:space="preserve"> e, muito menos, salário mensal fixo de R$ 2.000,00: atesta, quando muito, a quitação pontual de serviço prestado. Se o documento corresponde ao pagamento de </w:t>
+        <w:t>WILLIANS DA SILVA OLIVEIRA</w:t>
+      </w:r>
+      <w:r>
+        <w:rPr>
+          <w:rFonts w:ascii="Times New Roman" w:hAnsi="Times New Roman" w:cs="Times New Roman"/>
+          <w:b w:val="0"/>
+          <w:i w:val="0"/>
+          <w:sz w:val="24"/>
+        </w:rPr>
+        <w:t xml:space="preserve">, pessoa física que não se confunde com a BS CONSTRUÇÕES E REFORMAS LTDA., CNPJ nº 33.438.364/0001-07. </w:t>
       </w:r>
       <w:r>
         <w:rPr>
           <w:rFonts w:ascii="Times New Roman" w:hAnsi="Times New Roman" w:cs="Times New Roman"/>
           <w:b/>
           <w:i w:val="0"/>
-          <w:sz w:val="24"/>
-        </w:rPr>
-        <w:t>R$ 700,00 realizado em 19/05/2026</w:t>
-      </w:r>
-      <w:r>
-        <w:rPr>
-          <w:rFonts w:ascii="Times New Roman" w:hAnsi="Times New Roman" w:cs="Times New Roman"/>
-          <w:b w:val="0"/>
-          <w:i w:val="0"/>
-          <w:sz w:val="24"/>
-        </w:rPr>
-        <w:t xml:space="preserve">, ele </w:t>
-      </w:r>
-      <w:r>
-        <w:rPr>
-          <w:rFonts w:ascii="Times New Roman" w:hAnsi="Times New Roman" w:cs="Times New Roman"/>
-          <w:b/>
-          <w:i w:val="0"/>
-          <w:sz w:val="24"/>
-        </w:rPr>
-        <w:t>confirma a tese da defesa</w:t>
-      </w:r>
-      <w:r>
-        <w:rPr>
-          <w:rFonts w:ascii="Times New Roman" w:hAnsi="Times New Roman" w:cs="Times New Roman"/>
-          <w:b w:val="0"/>
-          <w:i w:val="0"/>
-          <w:sz w:val="24"/>
-        </w:rPr>
-        <w:t xml:space="preserve"> — pagamento avulso, por tarefa concluída, efetuado </w:t>
-      </w:r>
-      <w:r>
-        <w:rPr>
-          <w:rFonts w:ascii="Times New Roman" w:hAnsi="Times New Roman" w:cs="Times New Roman"/>
-          <w:b/>
-          <w:i w:val="0"/>
-          <w:sz w:val="24"/>
-        </w:rPr>
-        <w:t>após</w:t>
-      </w:r>
-      <w:r>
-        <w:rPr>
-          <w:rFonts w:ascii="Times New Roman" w:hAnsi="Times New Roman" w:cs="Times New Roman"/>
-          <w:b w:val="0"/>
-          <w:i w:val="0"/>
-          <w:sz w:val="24"/>
-        </w:rPr>
-        <w:t xml:space="preserve"> a data em que o próprio Autor afirma ter cessado a prestação (15/05/2026) e em valor incompatível com a remuneração mensal alegada. Requer-se, desde já, que qualquer valor nele consignado seja </w:t>
-      </w:r>
-      <w:r>
-        <w:rPr>
-          <w:rFonts w:ascii="Times New Roman" w:hAnsi="Times New Roman" w:cs="Times New Roman"/>
-          <w:b/>
-          <w:i w:val="0"/>
-          <w:sz w:val="24"/>
-        </w:rPr>
-        <w:t>deduzido</w:t>
-      </w:r>
-      <w:r>
-        <w:rPr>
-          <w:rFonts w:ascii="Times New Roman" w:hAnsi="Times New Roman" w:cs="Times New Roman"/>
-          <w:b w:val="0"/>
-          <w:i w:val="0"/>
-          <w:sz w:val="24"/>
-        </w:rPr>
-        <w:t xml:space="preserve"> de eventual condenação (art. 767 da CLT).</w:t>
+          <w:color w:val="FF0000"/>
+          <w:sz w:val="24"/>
+        </w:rPr>
+        <w:t>[CONFERIR COM O PREPOSTO, ANTES DA AUDIÊNCIA, se o Sr. Willians da Silva Oliveira possui qualquer relação com a Reclamada — sócio, empregado, preposto ou subempreiteiro. Somente após essa confirmação sustente, em audiência, tratar-se de terceiro inteiramente estranho à empresa.]</w:t>
       </w:r>
     </w:p>
     <w:p/>
@@ -1029,7 +1003,7 @@
           <w:i w:val="0"/>
           <w:sz w:val="24"/>
         </w:rPr>
-        <w:t xml:space="preserve">2. </w:t>
+        <w:t xml:space="preserve">Transferência realizada entre pessoas físicas, por terceiro que não é parte nesta lide, </w:t>
       </w:r>
       <w:r>
         <w:rPr>
@@ -1038,16 +1012,34 @@
           <w:i w:val="0"/>
           <w:sz w:val="24"/>
         </w:rPr>
-        <w:t>Documento de identidade (ID 18f4f13)</w:t>
-      </w:r>
-      <w:r>
-        <w:rPr>
-          <w:rFonts w:ascii="Times New Roman" w:hAnsi="Times New Roman" w:cs="Times New Roman"/>
-          <w:b w:val="0"/>
-          <w:i w:val="0"/>
-          <w:sz w:val="24"/>
-        </w:rPr>
-        <w:t xml:space="preserve"> — presta-se exclusivamente à qualificação civil do Autor, nada demonstrando quanto a admissão, função, salário, jornada ou modalidade de extinção contratual.</w:t>
+        <w:t>nada prova</w:t>
+      </w:r>
+      <w:r>
+        <w:rPr>
+          <w:rFonts w:ascii="Times New Roman" w:hAnsi="Times New Roman" w:cs="Times New Roman"/>
+          <w:b w:val="0"/>
+          <w:i w:val="0"/>
+          <w:sz w:val="24"/>
+        </w:rPr>
+        <w:t xml:space="preserve"> contra a Reclamada: não demonstra pagamento de salário, não demonstra contratação, não demonstra subordinação e não é oponível a quem não participou da operação. Ao contrário, evidencia que o Autor recebia valores de </w:t>
+      </w:r>
+      <w:r>
+        <w:rPr>
+          <w:rFonts w:ascii="Times New Roman" w:hAnsi="Times New Roman" w:cs="Times New Roman"/>
+          <w:b/>
+          <w:i w:val="0"/>
+          <w:sz w:val="24"/>
+        </w:rPr>
+        <w:t>origem diversa da empregadora</w:t>
+      </w:r>
+      <w:r>
+        <w:rPr>
+          <w:rFonts w:ascii="Times New Roman" w:hAnsi="Times New Roman" w:cs="Times New Roman"/>
+          <w:b w:val="0"/>
+          <w:i w:val="0"/>
+          <w:sz w:val="24"/>
+        </w:rPr>
+        <w:t>, o que apenas confirma que a prestação posterior a 09/04/2026 não se deu sob relação de emprego com a Contestante.</w:t>
       </w:r>
     </w:p>
     <w:p/>
@@ -1063,7 +1055,7 @@
           <w:i w:val="0"/>
           <w:sz w:val="24"/>
         </w:rPr>
-        <w:t xml:space="preserve">3. </w:t>
+        <w:t xml:space="preserve">Cumpre distinguir, para que não se confundam: o comprovante do Autor (ID 59a6bef) </w:t>
       </w:r>
       <w:r>
         <w:rPr>
@@ -1072,16 +1064,16 @@
           <w:i w:val="0"/>
           <w:sz w:val="24"/>
         </w:rPr>
-        <w:t>Instrumento de procuração (ID aa5c8b4)</w:t>
-      </w:r>
-      <w:r>
-        <w:rPr>
-          <w:rFonts w:ascii="Times New Roman" w:hAnsi="Times New Roman" w:cs="Times New Roman"/>
-          <w:b w:val="0"/>
-          <w:i w:val="0"/>
-          <w:sz w:val="24"/>
-        </w:rPr>
-        <w:t xml:space="preserve"> — impugna-se o seu conteúdo declaratório na parte em que qualifica o outorgante como </w:t>
+        <w:t>não corresponde</w:t>
+      </w:r>
+      <w:r>
+        <w:rPr>
+          <w:rFonts w:ascii="Times New Roman" w:hAnsi="Times New Roman" w:cs="Times New Roman"/>
+          <w:b w:val="0"/>
+          <w:i w:val="0"/>
+          <w:sz w:val="24"/>
+        </w:rPr>
+        <w:t xml:space="preserve"> ao pagamento de </w:t>
       </w:r>
       <w:r>
         <w:rPr>
@@ -1090,16 +1082,16 @@
           <w:i w:val="0"/>
           <w:sz w:val="24"/>
         </w:rPr>
-        <w:t>brasileiro</w:t>
-      </w:r>
-      <w:r>
-        <w:rPr>
-          <w:rFonts w:ascii="Times New Roman" w:hAnsi="Times New Roman" w:cs="Times New Roman"/>
-          <w:b w:val="0"/>
-          <w:i w:val="0"/>
-          <w:sz w:val="24"/>
-        </w:rPr>
-        <w:t xml:space="preserve">, em contradição com a qualificação de </w:t>
+        <w:t>R$ 700,00 efetuado pela Reclamada em 19/05/2026</w:t>
+      </w:r>
+      <w:r>
+        <w:rPr>
+          <w:rFonts w:ascii="Times New Roman" w:hAnsi="Times New Roman" w:cs="Times New Roman"/>
+          <w:b w:val="0"/>
+          <w:i w:val="0"/>
+          <w:sz w:val="24"/>
+        </w:rPr>
+        <w:t xml:space="preserve">, a título de empreitada, este sim documentado na defesa </w:t>
       </w:r>
       <w:r>
         <w:rPr>
@@ -1108,16 +1100,16 @@
           <w:i w:val="0"/>
           <w:sz w:val="24"/>
         </w:rPr>
-        <w:t>venezuelano</w:t>
-      </w:r>
-      <w:r>
-        <w:rPr>
-          <w:rFonts w:ascii="Times New Roman" w:hAnsi="Times New Roman" w:cs="Times New Roman"/>
-          <w:b w:val="0"/>
-          <w:i w:val="0"/>
-          <w:sz w:val="24"/>
-        </w:rPr>
-        <w:t xml:space="preserve"> constante da inicial, bem como a declaração genérica de pobreza nele inserida, na forma do item III.10 desta contestação.</w:t>
+        <w:t>(doc. anexo)</w:t>
+      </w:r>
+      <w:r>
+        <w:rPr>
+          <w:rFonts w:ascii="Times New Roman" w:hAnsi="Times New Roman" w:cs="Times New Roman"/>
+          <w:b w:val="0"/>
+          <w:i w:val="0"/>
+          <w:sz w:val="24"/>
+        </w:rPr>
+        <w:t>. São documentos distintos, de origens distintas.</w:t>
       </w:r>
     </w:p>
     <w:p/>
@@ -1133,7 +1125,7 @@
           <w:i w:val="0"/>
           <w:sz w:val="24"/>
         </w:rPr>
-        <w:t xml:space="preserve">4. </w:t>
+        <w:t xml:space="preserve">Requer-se, por isso, a </w:t>
       </w:r>
       <w:r>
         <w:rPr>
@@ -1142,70 +1134,16 @@
           <w:i w:val="0"/>
           <w:sz w:val="24"/>
         </w:rPr>
-        <w:t>Da ausência de qualquer prova do alegado — e da omissão do registro existente.</w:t>
-      </w:r>
-      <w:r>
-        <w:rPr>
-          <w:rFonts w:ascii="Times New Roman" w:hAnsi="Times New Roman" w:cs="Times New Roman"/>
-          <w:b w:val="0"/>
-          <w:i w:val="0"/>
-          <w:sz w:val="24"/>
-        </w:rPr>
-        <w:t xml:space="preserve"> Não há nos autos </w:t>
-      </w:r>
-      <w:r>
-        <w:rPr>
-          <w:rFonts w:ascii="Times New Roman" w:hAnsi="Times New Roman" w:cs="Times New Roman"/>
-          <w:b/>
-          <w:i w:val="0"/>
-          <w:sz w:val="24"/>
-        </w:rPr>
-        <w:t>um único documento</w:t>
-      </w:r>
-      <w:r>
-        <w:rPr>
-          <w:rFonts w:ascii="Times New Roman" w:hAnsi="Times New Roman" w:cs="Times New Roman"/>
-          <w:b w:val="0"/>
-          <w:i w:val="0"/>
-          <w:sz w:val="24"/>
-        </w:rPr>
-        <w:t xml:space="preserve"> que ampare a admissão em 10/03/2026, o salário mensal de R$ 2.000,00, a jornada narrada ou a dispensa imotivada em 15/05/2026. Mais do que isso: a inicial </w:t>
-      </w:r>
-      <w:r>
-        <w:rPr>
-          <w:rFonts w:ascii="Times New Roman" w:hAnsi="Times New Roman" w:cs="Times New Roman"/>
-          <w:b/>
-          <w:i w:val="0"/>
-          <w:sz w:val="24"/>
-        </w:rPr>
-        <w:t>omite deliberadamente o registro em CTPS</w:t>
-      </w:r>
-      <w:r>
-        <w:rPr>
-          <w:rFonts w:ascii="Times New Roman" w:hAnsi="Times New Roman" w:cs="Times New Roman"/>
-          <w:b w:val="0"/>
-          <w:i w:val="0"/>
-          <w:sz w:val="24"/>
-        </w:rPr>
-        <w:t xml:space="preserve"> que o próprio Autor ostenta, relativo ao período de 11/03/2026 a 09/04/2026, e cuja existência ele não poderia desconhecer — a CTPS é digital e de consulta imediata pelo próprio trabalhador. A afirmação de que "não foi registrado o contrato de trabalho em sua carteira de trabalho" é, portanto, </w:t>
-      </w:r>
-      <w:r>
-        <w:rPr>
-          <w:rFonts w:ascii="Times New Roman" w:hAnsi="Times New Roman" w:cs="Times New Roman"/>
-          <w:b/>
-          <w:i w:val="0"/>
-          <w:sz w:val="24"/>
-        </w:rPr>
-        <w:t>objetivamente contrária à prova documental</w:t>
-      </w:r>
-      <w:r>
-        <w:rPr>
-          <w:rFonts w:ascii="Times New Roman" w:hAnsi="Times New Roman" w:cs="Times New Roman"/>
-          <w:b w:val="0"/>
-          <w:i w:val="0"/>
-          <w:sz w:val="24"/>
-        </w:rPr>
-        <w:t>, o que se registra para os fins do art. 793-B, II, da CLT, sem prejuízo da apreciação de Vossa Excelência.</w:t>
+        <w:t>desconsideração</w:t>
+      </w:r>
+      <w:r>
+        <w:rPr>
+          <w:rFonts w:ascii="Times New Roman" w:hAnsi="Times New Roman" w:cs="Times New Roman"/>
+          <w:b w:val="0"/>
+          <w:i w:val="0"/>
+          <w:sz w:val="24"/>
+        </w:rPr>
+        <w:t xml:space="preserve"> do documento como meio de prova dos fatos constitutivos alegados, permanecendo íntegro o ônus do Autor (art. 818, I, da CLT c/c art. 373, I, do CPC).</w:t>
       </w:r>
     </w:p>
     <w:p/>
@@ -1221,7 +1159,25 @@
           <w:i w:val="0"/>
           <w:sz w:val="24"/>
         </w:rPr>
-        <w:t>Requer-se a desconsideração dos documentos da inicial como meio de prova dos fatos constitutivos alegados.</w:t>
+        <w:t xml:space="preserve">2. </w:t>
+      </w:r>
+      <w:r>
+        <w:rPr>
+          <w:rFonts w:ascii="Times New Roman" w:hAnsi="Times New Roman" w:cs="Times New Roman"/>
+          <w:b/>
+          <w:i w:val="0"/>
+          <w:sz w:val="24"/>
+        </w:rPr>
+        <w:t>Documento de identidade (ID 18f4f13)</w:t>
+      </w:r>
+      <w:r>
+        <w:rPr>
+          <w:rFonts w:ascii="Times New Roman" w:hAnsi="Times New Roman" w:cs="Times New Roman"/>
+          <w:b w:val="0"/>
+          <w:i w:val="0"/>
+          <w:sz w:val="24"/>
+        </w:rPr>
+        <w:t xml:space="preserve"> — presta-se exclusivamente à qualificação civil do Autor, nada demonstrando quanto a admissão, função, salário, jornada ou modalidade de extinção contratual.</w:t>
       </w:r>
     </w:p>
     <w:p/>
@@ -1233,11 +1189,65 @@
       <w:r>
         <w:rPr>
           <w:rFonts w:ascii="Times New Roman" w:hAnsi="Times New Roman" w:cs="Times New Roman"/>
+          <w:b w:val="0"/>
+          <w:i w:val="0"/>
+          <w:sz w:val="24"/>
+        </w:rPr>
+        <w:t xml:space="preserve">3. </w:t>
+      </w:r>
+      <w:r>
+        <w:rPr>
+          <w:rFonts w:ascii="Times New Roman" w:hAnsi="Times New Roman" w:cs="Times New Roman"/>
           <w:b/>
           <w:i w:val="0"/>
           <w:sz w:val="24"/>
         </w:rPr>
-        <w:t>III – DO MÉRITO</w:t>
+        <w:t>Instrumento de procuração (ID aa5c8b4)</w:t>
+      </w:r>
+      <w:r>
+        <w:rPr>
+          <w:rFonts w:ascii="Times New Roman" w:hAnsi="Times New Roman" w:cs="Times New Roman"/>
+          <w:b w:val="0"/>
+          <w:i w:val="0"/>
+          <w:sz w:val="24"/>
+        </w:rPr>
+        <w:t xml:space="preserve"> — impugna-se o seu conteúdo declaratório na parte em que qualifica o outorgante como </w:t>
+      </w:r>
+      <w:r>
+        <w:rPr>
+          <w:rFonts w:ascii="Times New Roman" w:hAnsi="Times New Roman" w:cs="Times New Roman"/>
+          <w:b/>
+          <w:i w:val="0"/>
+          <w:sz w:val="24"/>
+        </w:rPr>
+        <w:t>brasileiro</w:t>
+      </w:r>
+      <w:r>
+        <w:rPr>
+          <w:rFonts w:ascii="Times New Roman" w:hAnsi="Times New Roman" w:cs="Times New Roman"/>
+          <w:b w:val="0"/>
+          <w:i w:val="0"/>
+          <w:sz w:val="24"/>
+        </w:rPr>
+        <w:t xml:space="preserve">, em contradição com a qualificação de </w:t>
+      </w:r>
+      <w:r>
+        <w:rPr>
+          <w:rFonts w:ascii="Times New Roman" w:hAnsi="Times New Roman" w:cs="Times New Roman"/>
+          <w:b/>
+          <w:i w:val="0"/>
+          <w:sz w:val="24"/>
+        </w:rPr>
+        <w:t>venezuelano</w:t>
+      </w:r>
+      <w:r>
+        <w:rPr>
+          <w:rFonts w:ascii="Times New Roman" w:hAnsi="Times New Roman" w:cs="Times New Roman"/>
+          <w:b w:val="0"/>
+          <w:i w:val="0"/>
+          <w:sz w:val="24"/>
+        </w:rPr>
+        <w:t xml:space="preserve"> constante da inicial, bem como a declaração genérica de pobreza nele inserida, na forma do item III.10 desta contestação.</w:t>
       </w:r>
     </w:p>
     <w:p/>
@@ -1253,7 +1263,79 @@
           <w:i w:val="0"/>
           <w:sz w:val="24"/>
         </w:rPr>
-        <w:t>Superadas as preliminares, no mérito a presente contestação impugna especificamente cada um dos fatos, fundamentos jurídicos e pedidos formulados na exordial, na forma dos arts. 341 e 342 do CPC c/c art. 769 da CLT, presumindo-se verdadeiros apenas os fatos eventualmente não impugnados de forma específica. Passa-se à impugnação item a item, na ordem dos capítulos da petição inicial.</w:t>
+        <w:t xml:space="preserve">4. </w:t>
+      </w:r>
+      <w:r>
+        <w:rPr>
+          <w:rFonts w:ascii="Times New Roman" w:hAnsi="Times New Roman" w:cs="Times New Roman"/>
+          <w:b/>
+          <w:i w:val="0"/>
+          <w:sz w:val="24"/>
+        </w:rPr>
+        <w:t>Da ausência de qualquer prova do alegado — e da omissão do registro existente.</w:t>
+      </w:r>
+      <w:r>
+        <w:rPr>
+          <w:rFonts w:ascii="Times New Roman" w:hAnsi="Times New Roman" w:cs="Times New Roman"/>
+          <w:b w:val="0"/>
+          <w:i w:val="0"/>
+          <w:sz w:val="24"/>
+        </w:rPr>
+        <w:t xml:space="preserve"> Não há nos autos </w:t>
+      </w:r>
+      <w:r>
+        <w:rPr>
+          <w:rFonts w:ascii="Times New Roman" w:hAnsi="Times New Roman" w:cs="Times New Roman"/>
+          <w:b/>
+          <w:i w:val="0"/>
+          <w:sz w:val="24"/>
+        </w:rPr>
+        <w:t>um único documento</w:t>
+      </w:r>
+      <w:r>
+        <w:rPr>
+          <w:rFonts w:ascii="Times New Roman" w:hAnsi="Times New Roman" w:cs="Times New Roman"/>
+          <w:b w:val="0"/>
+          <w:i w:val="0"/>
+          <w:sz w:val="24"/>
+        </w:rPr>
+        <w:t xml:space="preserve"> que ampare a admissão em 10/03/2026, o salário mensal de R$ 2.000,00, a jornada narrada ou a dispensa imotivada em 15/05/2026. Mais do que isso: a inicial </w:t>
+      </w:r>
+      <w:r>
+        <w:rPr>
+          <w:rFonts w:ascii="Times New Roman" w:hAnsi="Times New Roman" w:cs="Times New Roman"/>
+          <w:b/>
+          <w:i w:val="0"/>
+          <w:sz w:val="24"/>
+        </w:rPr>
+        <w:t>omite deliberadamente o registro em CTPS</w:t>
+      </w:r>
+      <w:r>
+        <w:rPr>
+          <w:rFonts w:ascii="Times New Roman" w:hAnsi="Times New Roman" w:cs="Times New Roman"/>
+          <w:b w:val="0"/>
+          <w:i w:val="0"/>
+          <w:sz w:val="24"/>
+        </w:rPr>
+        <w:t xml:space="preserve"> que o próprio Autor ostenta, relativo ao período de 11/03/2026 a 09/04/2026, e cuja existência ele não poderia desconhecer — a CTPS é digital e de consulta imediata pelo próprio trabalhador. A afirmação de que "não foi registrado o contrato de trabalho em sua carteira de trabalho" é, portanto, </w:t>
+      </w:r>
+      <w:r>
+        <w:rPr>
+          <w:rFonts w:ascii="Times New Roman" w:hAnsi="Times New Roman" w:cs="Times New Roman"/>
+          <w:b/>
+          <w:i w:val="0"/>
+          <w:sz w:val="24"/>
+        </w:rPr>
+        <w:t>objetivamente contrária à prova documental</w:t>
+      </w:r>
+      <w:r>
+        <w:rPr>
+          <w:rFonts w:ascii="Times New Roman" w:hAnsi="Times New Roman" w:cs="Times New Roman"/>
+          <w:b w:val="0"/>
+          <w:i w:val="0"/>
+          <w:sz w:val="24"/>
+        </w:rPr>
+        <w:t>, o que se registra para os fins do art. 793-B, II, da CLT, sem prejuízo da apreciação de Vossa Excelência.</w:t>
       </w:r>
     </w:p>
     <w:p/>
@@ -1269,7 +1351,7 @@
           <w:i w:val="0"/>
           <w:sz w:val="24"/>
         </w:rPr>
-        <w:t>1. Do Contrato de Trabalho Efetivamente Havido — Registro em CTPS e Contrato de Experiência Extinto pelo Advento do Termo (capítulos 01 e 02 da inicial; pedido "II")</w:t>
+        <w:t>Requer-se a desconsideração dos documentos da inicial como meio de prova dos fatos constitutivos alegados.</w:t>
       </w:r>
     </w:p>
     <w:p/>
@@ -1281,11 +1363,11 @@
       <w:r>
         <w:rPr>
           <w:rFonts w:ascii="Times New Roman" w:hAnsi="Times New Roman" w:cs="Times New Roman"/>
-          <w:b w:val="0"/>
-          <w:i w:val="0"/>
-          <w:sz w:val="24"/>
-        </w:rPr>
-        <w:t>Alega o Autor ter sido admitido em 10/03/2026, sem registro, mediante salário mensal de R$ 2.000,00, e dispensado sem justa causa em 15/05/2026.</w:t>
+          <w:b/>
+          <w:i w:val="0"/>
+          <w:sz w:val="24"/>
+        </w:rPr>
+        <w:t>III – DO MÉRITO</w:t>
       </w:r>
     </w:p>
     <w:p/>
@@ -1301,116 +1383,7 @@
           <w:i w:val="0"/>
           <w:sz w:val="24"/>
         </w:rPr>
-        <w:t xml:space="preserve">A realidade documental é outra, e a Reclamada não a nega — ao contrário, a comprova: o Reclamante </w:t>
-      </w:r>
-      <w:r>
-        <w:rPr>
-          <w:rFonts w:ascii="Times New Roman" w:hAnsi="Times New Roman" w:cs="Times New Roman"/>
-          <w:b/>
-          <w:i w:val="0"/>
-          <w:sz w:val="24"/>
-        </w:rPr>
-        <w:t>foi contratado e regularmente registrado</w:t>
-      </w:r>
-      <w:r>
-        <w:rPr>
-          <w:rFonts w:ascii="Times New Roman" w:hAnsi="Times New Roman" w:cs="Times New Roman"/>
-          <w:b w:val="0"/>
-          <w:i w:val="0"/>
-          <w:sz w:val="24"/>
-        </w:rPr>
-        <w:t xml:space="preserve">, com anotação na CTPS e na Ficha de Registro de Empregado, no período de </w:t>
-      </w:r>
-      <w:r>
-        <w:rPr>
-          <w:rFonts w:ascii="Times New Roman" w:hAnsi="Times New Roman" w:cs="Times New Roman"/>
-          <w:b/>
-          <w:i w:val="0"/>
-          <w:sz w:val="24"/>
-        </w:rPr>
-        <w:t>11/03/2026 a 09/04/2026</w:t>
-      </w:r>
-      <w:r>
-        <w:rPr>
-          <w:rFonts w:ascii="Times New Roman" w:hAnsi="Times New Roman" w:cs="Times New Roman"/>
-          <w:b w:val="0"/>
-          <w:i w:val="0"/>
-          <w:sz w:val="24"/>
-        </w:rPr>
-        <w:t xml:space="preserve">, sob </w:t>
-      </w:r>
-      <w:r>
-        <w:rPr>
-          <w:rFonts w:ascii="Times New Roman" w:hAnsi="Times New Roman" w:cs="Times New Roman"/>
-          <w:b/>
-          <w:i w:val="0"/>
-          <w:sz w:val="24"/>
-        </w:rPr>
-        <w:t>contrato de experiência</w:t>
-      </w:r>
-      <w:r>
-        <w:rPr>
-          <w:rFonts w:ascii="Times New Roman" w:hAnsi="Times New Roman" w:cs="Times New Roman"/>
-          <w:b w:val="0"/>
-          <w:i w:val="0"/>
-          <w:sz w:val="24"/>
-        </w:rPr>
-        <w:t xml:space="preserve"> escrito e assinado, cuja extinção decorreu do </w:t>
-      </w:r>
-      <w:r>
-        <w:rPr>
-          <w:rFonts w:ascii="Times New Roman" w:hAnsi="Times New Roman" w:cs="Times New Roman"/>
-          <w:b/>
-          <w:i w:val="0"/>
-          <w:sz w:val="24"/>
-        </w:rPr>
-        <w:t>advento do termo final</w:t>
-      </w:r>
-      <w:r>
-        <w:rPr>
-          <w:rFonts w:ascii="Times New Roman" w:hAnsi="Times New Roman" w:cs="Times New Roman"/>
-          <w:b w:val="0"/>
-          <w:i w:val="0"/>
-          <w:sz w:val="24"/>
-        </w:rPr>
-        <w:t xml:space="preserve"> nele ajustado </w:t>
-      </w:r>
-      <w:r>
-        <w:rPr>
-          <w:rFonts w:ascii="Times New Roman" w:hAnsi="Times New Roman" w:cs="Times New Roman"/>
-          <w:b/>
-          <w:i w:val="0"/>
-          <w:sz w:val="24"/>
-        </w:rPr>
-        <w:t>(doc. anexo)</w:t>
-      </w:r>
-      <w:r>
-        <w:rPr>
-          <w:rFonts w:ascii="Times New Roman" w:hAnsi="Times New Roman" w:cs="Times New Roman"/>
-          <w:b w:val="0"/>
-          <w:i w:val="0"/>
-          <w:sz w:val="24"/>
-        </w:rPr>
-        <w:t xml:space="preserve"> </w:t>
-      </w:r>
-      <w:r>
-        <w:rPr>
-          <w:rFonts w:ascii="Times New Roman" w:hAnsi="Times New Roman" w:cs="Times New Roman"/>
-          <w:b/>
-          <w:i w:val="0"/>
-          <w:color w:val="FF0000"/>
-          <w:sz w:val="24"/>
-        </w:rPr>
-        <w:t>[doc. anexo — CONFIRMAR JUNTADA: ficha de registro, CTPS Digital, contrato de experiência assinado e TRCT]</w:t>
-      </w:r>
-      <w:r>
-        <w:rPr>
-          <w:rFonts w:ascii="Times New Roman" w:hAnsi="Times New Roman" w:cs="Times New Roman"/>
-          <w:b w:val="0"/>
-          <w:i w:val="0"/>
-          <w:sz w:val="24"/>
-        </w:rPr>
-        <w:t>.</w:t>
+        <w:t>Superadas as preliminares, no mérito a presente contestação impugna especificamente cada um dos fatos, fundamentos jurídicos e pedidos formulados na exordial, na forma dos arts. 341 e 342 do CPC c/c art. 769 da CLT, presumindo-se verdadeiros apenas os fatos eventualmente não impugnados de forma específica. Passa-se à impugnação item a item, na ordem dos capítulos da petição inicial.</w:t>
       </w:r>
     </w:p>
     <w:p/>
@@ -1426,61 +1399,7 @@
           <w:i w:val="0"/>
           <w:sz w:val="24"/>
         </w:rPr>
-        <w:t xml:space="preserve">O contrato de experiência é modalidade </w:t>
-      </w:r>
-      <w:r>
-        <w:rPr>
-          <w:rFonts w:ascii="Times New Roman" w:hAnsi="Times New Roman" w:cs="Times New Roman"/>
-          <w:b/>
-          <w:i w:val="0"/>
-          <w:sz w:val="24"/>
-        </w:rPr>
-        <w:t>expressamente autorizada</w:t>
-      </w:r>
-      <w:r>
-        <w:rPr>
-          <w:rFonts w:ascii="Times New Roman" w:hAnsi="Times New Roman" w:cs="Times New Roman"/>
-          <w:b w:val="0"/>
-          <w:i w:val="0"/>
-          <w:sz w:val="24"/>
-        </w:rPr>
-        <w:t xml:space="preserve"> pelo art. 443, § 2º, "c", da CLT, com prazo máximo de 90 (noventa) dias, na forma do art. 445, parágrafo único, da CLT — limite integralmente observado, já que o pacto durou </w:t>
-      </w:r>
-      <w:r>
-        <w:rPr>
-          <w:rFonts w:ascii="Times New Roman" w:hAnsi="Times New Roman" w:cs="Times New Roman"/>
-          <w:b/>
-          <w:i w:val="0"/>
-          <w:sz w:val="24"/>
-        </w:rPr>
-        <w:t>30 (trinta) dias</w:t>
-      </w:r>
-      <w:r>
-        <w:rPr>
-          <w:rFonts w:ascii="Times New Roman" w:hAnsi="Times New Roman" w:cs="Times New Roman"/>
-          <w:b w:val="0"/>
-          <w:i w:val="0"/>
-          <w:sz w:val="24"/>
-        </w:rPr>
-        <w:t xml:space="preserve">. Extinto pelo decurso do prazo, o contrato a termo </w:t>
-      </w:r>
-      <w:r>
-        <w:rPr>
-          <w:rFonts w:ascii="Times New Roman" w:hAnsi="Times New Roman" w:cs="Times New Roman"/>
-          <w:b/>
-          <w:i w:val="0"/>
-          <w:sz w:val="24"/>
-        </w:rPr>
-        <w:t>não gera</w:t>
-      </w:r>
-      <w:r>
-        <w:rPr>
-          <w:rFonts w:ascii="Times New Roman" w:hAnsi="Times New Roman" w:cs="Times New Roman"/>
-          <w:b w:val="0"/>
-          <w:i w:val="0"/>
-          <w:sz w:val="24"/>
-        </w:rPr>
-        <w:t xml:space="preserve"> as verbas próprias da dispensa imotivada, como se verá no item III.3.</w:t>
+        <w:t>1. Do Contrato de Trabalho Efetivamente Havido — Registro em CTPS e Contrato de Experiência Extinto pelo Advento do Termo (capítulos 01 e 02 da inicial; pedido "II")</w:t>
       </w:r>
     </w:p>
     <w:p/>
@@ -1496,25 +1415,7 @@
           <w:i w:val="0"/>
           <w:sz w:val="24"/>
         </w:rPr>
-        <w:t xml:space="preserve">Impugnam-se, assim, </w:t>
-      </w:r>
-      <w:r>
-        <w:rPr>
-          <w:rFonts w:ascii="Times New Roman" w:hAnsi="Times New Roman" w:cs="Times New Roman"/>
-          <w:b/>
-          <w:i w:val="0"/>
-          <w:sz w:val="24"/>
-        </w:rPr>
-        <w:t>especificamente</w:t>
-      </w:r>
-      <w:r>
-        <w:rPr>
-          <w:rFonts w:ascii="Times New Roman" w:hAnsi="Times New Roman" w:cs="Times New Roman"/>
-          <w:b w:val="0"/>
-          <w:i w:val="0"/>
-          <w:sz w:val="24"/>
-        </w:rPr>
-        <w:t>:</w:t>
+        <w:t>Alega o Autor ter sido admitido em 10/03/2026, sem registro, mediante salário mensal de R$ 2.000,00, e dispensado sem justa causa em 15/05/2026.</w:t>
       </w:r>
     </w:p>
     <w:p/>
@@ -1530,7 +1431,7 @@
           <w:i w:val="0"/>
           <w:sz w:val="24"/>
         </w:rPr>
-        <w:t xml:space="preserve">a) </w:t>
+        <w:t xml:space="preserve">A realidade documental é outra, e a Reclamada não a nega — ao contrário, a comprova: o Reclamante </w:t>
       </w:r>
       <w:r>
         <w:rPr>
@@ -1539,16 +1440,16 @@
           <w:i w:val="0"/>
           <w:sz w:val="24"/>
         </w:rPr>
-        <w:t>a data de admissão de 10/03/2026</w:t>
-      </w:r>
-      <w:r>
-        <w:rPr>
-          <w:rFonts w:ascii="Times New Roman" w:hAnsi="Times New Roman" w:cs="Times New Roman"/>
-          <w:b w:val="0"/>
-          <w:i w:val="0"/>
-          <w:sz w:val="24"/>
-        </w:rPr>
-        <w:t xml:space="preserve"> — o registro, o contrato de experiência e a documentação da empresa apontam </w:t>
+        <w:t>foi contratado e regularmente registrado</w:t>
+      </w:r>
+      <w:r>
+        <w:rPr>
+          <w:rFonts w:ascii="Times New Roman" w:hAnsi="Times New Roman" w:cs="Times New Roman"/>
+          <w:b w:val="0"/>
+          <w:i w:val="0"/>
+          <w:sz w:val="24"/>
+        </w:rPr>
+        <w:t xml:space="preserve">, com anotação na CTPS e na Ficha de Registro de Empregado, no período de </w:t>
       </w:r>
       <w:r>
         <w:rPr>
@@ -1557,16 +1458,89 @@
           <w:i w:val="0"/>
           <w:sz w:val="24"/>
         </w:rPr>
-        <w:t>11/03/2026</w:t>
-      </w:r>
-      <w:r>
-        <w:rPr>
-          <w:rFonts w:ascii="Times New Roman" w:hAnsi="Times New Roman" w:cs="Times New Roman"/>
-          <w:b w:val="0"/>
-          <w:i w:val="0"/>
-          <w:sz w:val="24"/>
-        </w:rPr>
-        <w:t>, e o Autor não produziu qualquer prova do dia anterior;</w:t>
+        <w:t>11/03/2026 a 09/04/2026</w:t>
+      </w:r>
+      <w:r>
+        <w:rPr>
+          <w:rFonts w:ascii="Times New Roman" w:hAnsi="Times New Roman" w:cs="Times New Roman"/>
+          <w:b w:val="0"/>
+          <w:i w:val="0"/>
+          <w:sz w:val="24"/>
+        </w:rPr>
+        <w:t xml:space="preserve">, sob </w:t>
+      </w:r>
+      <w:r>
+        <w:rPr>
+          <w:rFonts w:ascii="Times New Roman" w:hAnsi="Times New Roman" w:cs="Times New Roman"/>
+          <w:b/>
+          <w:i w:val="0"/>
+          <w:sz w:val="24"/>
+        </w:rPr>
+        <w:t>contrato de experiência</w:t>
+      </w:r>
+      <w:r>
+        <w:rPr>
+          <w:rFonts w:ascii="Times New Roman" w:hAnsi="Times New Roman" w:cs="Times New Roman"/>
+          <w:b w:val="0"/>
+          <w:i w:val="0"/>
+          <w:sz w:val="24"/>
+        </w:rPr>
+        <w:t xml:space="preserve"> escrito e assinado, cuja extinção decorreu do </w:t>
+      </w:r>
+      <w:r>
+        <w:rPr>
+          <w:rFonts w:ascii="Times New Roman" w:hAnsi="Times New Roman" w:cs="Times New Roman"/>
+          <w:b/>
+          <w:i w:val="0"/>
+          <w:sz w:val="24"/>
+        </w:rPr>
+        <w:t>advento do termo final</w:t>
+      </w:r>
+      <w:r>
+        <w:rPr>
+          <w:rFonts w:ascii="Times New Roman" w:hAnsi="Times New Roman" w:cs="Times New Roman"/>
+          <w:b w:val="0"/>
+          <w:i w:val="0"/>
+          <w:sz w:val="24"/>
+        </w:rPr>
+        <w:t xml:space="preserve"> nele ajustado </w:t>
+      </w:r>
+      <w:r>
+        <w:rPr>
+          <w:rFonts w:ascii="Times New Roman" w:hAnsi="Times New Roman" w:cs="Times New Roman"/>
+          <w:b/>
+          <w:i w:val="0"/>
+          <w:sz w:val="24"/>
+        </w:rPr>
+        <w:t>(doc. anexo)</w:t>
+      </w:r>
+      <w:r>
+        <w:rPr>
+          <w:rFonts w:ascii="Times New Roman" w:hAnsi="Times New Roman" w:cs="Times New Roman"/>
+          <w:b w:val="0"/>
+          <w:i w:val="0"/>
+          <w:sz w:val="24"/>
+        </w:rPr>
+        <w:t xml:space="preserve"> </w:t>
+      </w:r>
+      <w:r>
+        <w:rPr>
+          <w:rFonts w:ascii="Times New Roman" w:hAnsi="Times New Roman" w:cs="Times New Roman"/>
+          <w:b/>
+          <w:i w:val="0"/>
+          <w:color w:val="FF0000"/>
+          <w:sz w:val="24"/>
+        </w:rPr>
+        <w:t>[doc. anexo — CONFIRMAR JUNTADA: ficha de registro, CTPS Digital, contrato de experiência assinado e TRCT]</w:t>
+      </w:r>
+      <w:r>
+        <w:rPr>
+          <w:rFonts w:ascii="Times New Roman" w:hAnsi="Times New Roman" w:cs="Times New Roman"/>
+          <w:b w:val="0"/>
+          <w:i w:val="0"/>
+          <w:sz w:val="24"/>
+        </w:rPr>
+        <w:t>.</w:t>
       </w:r>
     </w:p>
     <w:p/>
@@ -1582,7 +1556,7 @@
           <w:i w:val="0"/>
           <w:sz w:val="24"/>
         </w:rPr>
-        <w:t xml:space="preserve">b) </w:t>
+        <w:t xml:space="preserve">O contrato de experiência é modalidade </w:t>
       </w:r>
       <w:r>
         <w:rPr>
@@ -1591,16 +1565,16 @@
           <w:i w:val="0"/>
           <w:sz w:val="24"/>
         </w:rPr>
-        <w:t>a data de término de 15/05/2026</w:t>
-      </w:r>
-      <w:r>
-        <w:rPr>
-          <w:rFonts w:ascii="Times New Roman" w:hAnsi="Times New Roman" w:cs="Times New Roman"/>
-          <w:b w:val="0"/>
-          <w:i w:val="0"/>
-          <w:sz w:val="24"/>
-        </w:rPr>
-        <w:t xml:space="preserve"> — o contrato de trabalho encerrou-se em </w:t>
+        <w:t>expressamente autorizada</w:t>
+      </w:r>
+      <w:r>
+        <w:rPr>
+          <w:rFonts w:ascii="Times New Roman" w:hAnsi="Times New Roman" w:cs="Times New Roman"/>
+          <w:b w:val="0"/>
+          <w:i w:val="0"/>
+          <w:sz w:val="24"/>
+        </w:rPr>
+        <w:t xml:space="preserve"> pelo art. 443, § 2º, "c", da CLT, com prazo máximo de 90 (noventa) dias, na forma do art. 445, parágrafo único, da CLT — limite integralmente observado, já que o pacto durou </w:t>
       </w:r>
       <w:r>
         <w:rPr>
@@ -1609,16 +1583,34 @@
           <w:i w:val="0"/>
           <w:sz w:val="24"/>
         </w:rPr>
-        <w:t>09/04/2026</w:t>
-      </w:r>
-      <w:r>
-        <w:rPr>
-          <w:rFonts w:ascii="Times New Roman" w:hAnsi="Times New Roman" w:cs="Times New Roman"/>
-          <w:b w:val="0"/>
-          <w:i w:val="0"/>
-          <w:sz w:val="24"/>
-        </w:rPr>
-        <w:t>, pelo advento do termo;</w:t>
+        <w:t>30 (trinta) dias</w:t>
+      </w:r>
+      <w:r>
+        <w:rPr>
+          <w:rFonts w:ascii="Times New Roman" w:hAnsi="Times New Roman" w:cs="Times New Roman"/>
+          <w:b w:val="0"/>
+          <w:i w:val="0"/>
+          <w:sz w:val="24"/>
+        </w:rPr>
+        <w:t xml:space="preserve">. Extinto pelo decurso do prazo, o contrato a termo </w:t>
+      </w:r>
+      <w:r>
+        <w:rPr>
+          <w:rFonts w:ascii="Times New Roman" w:hAnsi="Times New Roman" w:cs="Times New Roman"/>
+          <w:b/>
+          <w:i w:val="0"/>
+          <w:sz w:val="24"/>
+        </w:rPr>
+        <w:t>não gera</w:t>
+      </w:r>
+      <w:r>
+        <w:rPr>
+          <w:rFonts w:ascii="Times New Roman" w:hAnsi="Times New Roman" w:cs="Times New Roman"/>
+          <w:b w:val="0"/>
+          <w:i w:val="0"/>
+          <w:sz w:val="24"/>
+        </w:rPr>
+        <w:t xml:space="preserve"> as verbas próprias da dispensa imotivada, como se verá no item III.3.</w:t>
       </w:r>
     </w:p>
     <w:p/>
@@ -1634,7 +1626,7 @@
           <w:i w:val="0"/>
           <w:sz w:val="24"/>
         </w:rPr>
-        <w:t xml:space="preserve">c) </w:t>
+        <w:t xml:space="preserve">Impugnam-se, assim, </w:t>
       </w:r>
       <w:r>
         <w:rPr>
@@ -1643,34 +1635,16 @@
           <w:i w:val="0"/>
           <w:sz w:val="24"/>
         </w:rPr>
-        <w:t>a modalidade de extinção</w:t>
-      </w:r>
-      <w:r>
-        <w:rPr>
-          <w:rFonts w:ascii="Times New Roman" w:hAnsi="Times New Roman" w:cs="Times New Roman"/>
-          <w:b w:val="0"/>
-          <w:i w:val="0"/>
-          <w:sz w:val="24"/>
-        </w:rPr>
-        <w:t xml:space="preserve"> — não houve dispensa imotivada, mas </w:t>
-      </w:r>
-      <w:r>
-        <w:rPr>
-          <w:rFonts w:ascii="Times New Roman" w:hAnsi="Times New Roman" w:cs="Times New Roman"/>
-          <w:b/>
-          <w:i w:val="0"/>
-          <w:sz w:val="24"/>
-        </w:rPr>
-        <w:t>término do contrato de experiência</w:t>
-      </w:r>
-      <w:r>
-        <w:rPr>
-          <w:rFonts w:ascii="Times New Roman" w:hAnsi="Times New Roman" w:cs="Times New Roman"/>
-          <w:b w:val="0"/>
-          <w:i w:val="0"/>
-          <w:sz w:val="24"/>
-        </w:rPr>
-        <w:t>;</w:t>
+        <w:t>especificamente</w:t>
+      </w:r>
+      <w:r>
+        <w:rPr>
+          <w:rFonts w:ascii="Times New Roman" w:hAnsi="Times New Roman" w:cs="Times New Roman"/>
+          <w:b w:val="0"/>
+          <w:i w:val="0"/>
+          <w:sz w:val="24"/>
+        </w:rPr>
+        <w:t>:</w:t>
       </w:r>
     </w:p>
     <w:p/>
@@ -1686,7 +1660,7 @@
           <w:i w:val="0"/>
           <w:sz w:val="24"/>
         </w:rPr>
-        <w:t xml:space="preserve">d) </w:t>
+        <w:t xml:space="preserve">a) </w:t>
       </w:r>
       <w:r>
         <w:rPr>
@@ -1695,35 +1669,34 @@
           <w:i w:val="0"/>
           <w:sz w:val="24"/>
         </w:rPr>
-        <w:t>o salário mensal de R$ 2.000,00</w:t>
-      </w:r>
-      <w:r>
-        <w:rPr>
-          <w:rFonts w:ascii="Times New Roman" w:hAnsi="Times New Roman" w:cs="Times New Roman"/>
-          <w:b w:val="0"/>
-          <w:i w:val="0"/>
-          <w:sz w:val="24"/>
-        </w:rPr>
-        <w:t xml:space="preserve"> — a remuneração efetivamente ajustada e registrada é a que consta da Ficha de Registro e dos recibos de pagamento </w:t>
+        <w:t>a data de admissão de 10/03/2026</w:t>
+      </w:r>
+      <w:r>
+        <w:rPr>
+          <w:rFonts w:ascii="Times New Roman" w:hAnsi="Times New Roman" w:cs="Times New Roman"/>
+          <w:b w:val="0"/>
+          <w:i w:val="0"/>
+          <w:sz w:val="24"/>
+        </w:rPr>
+        <w:t xml:space="preserve"> — o registro, o contrato de experiência e a documentação da empresa apontam </w:t>
       </w:r>
       <w:r>
         <w:rPr>
           <w:rFonts w:ascii="Times New Roman" w:hAnsi="Times New Roman" w:cs="Times New Roman"/>
           <w:b/>
           <w:i w:val="0"/>
-          <w:color w:val="FF0000"/>
-          <w:sz w:val="24"/>
-        </w:rPr>
-        <w:t>[CONFERIR SALÁRIO ANOTADO NA CTPS E NA FICHA DE REGISTRO]</w:t>
-      </w:r>
-      <w:r>
-        <w:rPr>
-          <w:rFonts w:ascii="Times New Roman" w:hAnsi="Times New Roman" w:cs="Times New Roman"/>
-          <w:b w:val="0"/>
-          <w:i w:val="0"/>
-          <w:sz w:val="24"/>
-        </w:rPr>
-        <w:t>, sendo o valor da contraprestação fato constitutivo do direito do Autor, que dele não se desincumbiu (art. 818, I, da CLT c/c art. 373, I, do CPC);</w:t>
+          <w:sz w:val="24"/>
+        </w:rPr>
+        <w:t>11/03/2026</w:t>
+      </w:r>
+      <w:r>
+        <w:rPr>
+          <w:rFonts w:ascii="Times New Roman" w:hAnsi="Times New Roman" w:cs="Times New Roman"/>
+          <w:b w:val="0"/>
+          <w:i w:val="0"/>
+          <w:sz w:val="24"/>
+        </w:rPr>
+        <w:t>, e o Autor não produziu qualquer prova do dia anterior;</w:t>
       </w:r>
     </w:p>
     <w:p/>
@@ -1739,7 +1712,7 @@
           <w:i w:val="0"/>
           <w:sz w:val="24"/>
         </w:rPr>
-        <w:t xml:space="preserve">e) </w:t>
+        <w:t xml:space="preserve">b) </w:t>
       </w:r>
       <w:r>
         <w:rPr>
@@ -1748,16 +1721,34 @@
           <w:i w:val="0"/>
           <w:sz w:val="24"/>
         </w:rPr>
-        <w:t>a alegação de ausência de registro</w:t>
-      </w:r>
-      <w:r>
-        <w:rPr>
-          <w:rFonts w:ascii="Times New Roman" w:hAnsi="Times New Roman" w:cs="Times New Roman"/>
-          <w:b w:val="0"/>
-          <w:i w:val="0"/>
-          <w:sz w:val="24"/>
-        </w:rPr>
-        <w:t xml:space="preserve"> — desmentida pela própria CTPS do Reclamante.</w:t>
+        <w:t>a data de término de 15/05/2026</w:t>
+      </w:r>
+      <w:r>
+        <w:rPr>
+          <w:rFonts w:ascii="Times New Roman" w:hAnsi="Times New Roman" w:cs="Times New Roman"/>
+          <w:b w:val="0"/>
+          <w:i w:val="0"/>
+          <w:sz w:val="24"/>
+        </w:rPr>
+        <w:t xml:space="preserve"> — o contrato de trabalho encerrou-se em </w:t>
+      </w:r>
+      <w:r>
+        <w:rPr>
+          <w:rFonts w:ascii="Times New Roman" w:hAnsi="Times New Roman" w:cs="Times New Roman"/>
+          <w:b/>
+          <w:i w:val="0"/>
+          <w:sz w:val="24"/>
+        </w:rPr>
+        <w:t>09/04/2026</w:t>
+      </w:r>
+      <w:r>
+        <w:rPr>
+          <w:rFonts w:ascii="Times New Roman" w:hAnsi="Times New Roman" w:cs="Times New Roman"/>
+          <w:b w:val="0"/>
+          <w:i w:val="0"/>
+          <w:sz w:val="24"/>
+        </w:rPr>
+        <w:t>, pelo advento do termo;</w:t>
       </w:r>
     </w:p>
     <w:p/>
@@ -1773,7 +1764,7 @@
           <w:i w:val="0"/>
           <w:sz w:val="24"/>
         </w:rPr>
-        <w:t xml:space="preserve">Impugna-se, ainda, a jornada narrada na inicial ("de segunda a sexta-feira, além de dois sábados por mês, das 07:30h as 17h, além de realizar sobrejornada habitualmente"): no período contratual o Autor cumpria a jornada contratada, sem sobrejornada habitual. Registre-se a incoerência: embora a inicial afirme a existência de sobrejornada habitual, </w:t>
+        <w:t xml:space="preserve">c) </w:t>
       </w:r>
       <w:r>
         <w:rPr>
@@ -1782,16 +1773,34 @@
           <w:i w:val="0"/>
           <w:sz w:val="24"/>
         </w:rPr>
-        <w:t>nenhum pedido de horas extras foi formulado</w:t>
-      </w:r>
-      <w:r>
-        <w:rPr>
-          <w:rFonts w:ascii="Times New Roman" w:hAnsi="Times New Roman" w:cs="Times New Roman"/>
-          <w:b w:val="0"/>
-          <w:i w:val="0"/>
-          <w:sz w:val="24"/>
-        </w:rPr>
-        <w:t xml:space="preserve"> — nem no capítulo 03, nem no rol de pedidos —, o que revela que a narrativa de jornada foi inserida apenas para emprestar aparência de subordinação, e não para amparar pretensão real.</w:t>
+        <w:t>a modalidade de extinção</w:t>
+      </w:r>
+      <w:r>
+        <w:rPr>
+          <w:rFonts w:ascii="Times New Roman" w:hAnsi="Times New Roman" w:cs="Times New Roman"/>
+          <w:b w:val="0"/>
+          <w:i w:val="0"/>
+          <w:sz w:val="24"/>
+        </w:rPr>
+        <w:t xml:space="preserve"> — não houve dispensa imotivada, mas </w:t>
+      </w:r>
+      <w:r>
+        <w:rPr>
+          <w:rFonts w:ascii="Times New Roman" w:hAnsi="Times New Roman" w:cs="Times New Roman"/>
+          <w:b/>
+          <w:i w:val="0"/>
+          <w:sz w:val="24"/>
+        </w:rPr>
+        <w:t>término do contrato de experiência</w:t>
+      </w:r>
+      <w:r>
+        <w:rPr>
+          <w:rFonts w:ascii="Times New Roman" w:hAnsi="Times New Roman" w:cs="Times New Roman"/>
+          <w:b w:val="0"/>
+          <w:i w:val="0"/>
+          <w:sz w:val="24"/>
+        </w:rPr>
+        <w:t>;</w:t>
       </w:r>
     </w:p>
     <w:p/>
@@ -1803,74 +1812,48 @@
       <w:r>
         <w:rPr>
           <w:rFonts w:ascii="Times New Roman" w:hAnsi="Times New Roman" w:cs="Times New Roman"/>
+          <w:b w:val="0"/>
+          <w:i w:val="0"/>
+          <w:sz w:val="24"/>
+        </w:rPr>
+        <w:t xml:space="preserve">d) </w:t>
+      </w:r>
+      <w:r>
+        <w:rPr>
+          <w:rFonts w:ascii="Times New Roman" w:hAnsi="Times New Roman" w:cs="Times New Roman"/>
           <w:b/>
           <w:i w:val="0"/>
           <w:sz w:val="24"/>
         </w:rPr>
-        <w:t>Quanto ao pedido "II"</w:t>
-      </w:r>
-      <w:r>
-        <w:rPr>
-          <w:rFonts w:ascii="Times New Roman" w:hAnsi="Times New Roman" w:cs="Times New Roman"/>
-          <w:b w:val="0"/>
-          <w:i w:val="0"/>
-          <w:sz w:val="24"/>
-        </w:rPr>
-        <w:t xml:space="preserve">, o reconhecimento de vínculo e a anotação da CTPS estão </w:t>
+        <w:t>o salário mensal de R$ 2.000,00</w:t>
+      </w:r>
+      <w:r>
+        <w:rPr>
+          <w:rFonts w:ascii="Times New Roman" w:hAnsi="Times New Roman" w:cs="Times New Roman"/>
+          <w:b w:val="0"/>
+          <w:i w:val="0"/>
+          <w:sz w:val="24"/>
+        </w:rPr>
+        <w:t xml:space="preserve"> — a remuneração efetivamente ajustada e registrada é a que consta da Ficha de Registro e dos recibos de pagamento </w:t>
       </w:r>
       <w:r>
         <w:rPr>
           <w:rFonts w:ascii="Times New Roman" w:hAnsi="Times New Roman" w:cs="Times New Roman"/>
           <w:b/>
           <w:i w:val="0"/>
-          <w:sz w:val="24"/>
-        </w:rPr>
-        <w:t>prejudicados</w:t>
-      </w:r>
-      <w:r>
-        <w:rPr>
-          <w:rFonts w:ascii="Times New Roman" w:hAnsi="Times New Roman" w:cs="Times New Roman"/>
-          <w:b w:val="0"/>
-          <w:i w:val="0"/>
-          <w:sz w:val="24"/>
-        </w:rPr>
-        <w:t xml:space="preserve"> no período de 11/03/2026 a 09/04/2026, porque a anotação </w:t>
-      </w:r>
-      <w:r>
-        <w:rPr>
-          <w:rFonts w:ascii="Times New Roman" w:hAnsi="Times New Roman" w:cs="Times New Roman"/>
-          <w:b/>
-          <w:i w:val="0"/>
-          <w:sz w:val="24"/>
-        </w:rPr>
-        <w:t>já existe</w:t>
-      </w:r>
-      <w:r>
-        <w:rPr>
-          <w:rFonts w:ascii="Times New Roman" w:hAnsi="Times New Roman" w:cs="Times New Roman"/>
-          <w:b w:val="0"/>
-          <w:i w:val="0"/>
-          <w:sz w:val="24"/>
-        </w:rPr>
-        <w:t xml:space="preserve"> e é regular; e são </w:t>
-      </w:r>
-      <w:r>
-        <w:rPr>
-          <w:rFonts w:ascii="Times New Roman" w:hAnsi="Times New Roman" w:cs="Times New Roman"/>
-          <w:b/>
-          <w:i w:val="0"/>
-          <w:sz w:val="24"/>
-        </w:rPr>
-        <w:t>improcedentes</w:t>
-      </w:r>
-      <w:r>
-        <w:rPr>
-          <w:rFonts w:ascii="Times New Roman" w:hAnsi="Times New Roman" w:cs="Times New Roman"/>
-          <w:b w:val="0"/>
-          <w:i w:val="0"/>
-          <w:sz w:val="24"/>
-        </w:rPr>
-        <w:t xml:space="preserve"> quanto ao período posterior, pelas razões do item III.2. Subsidiariamente, acaso este Douto Juízo entenda de determinar qualquer retificação — o que se admite estritamente pelo princípio da eventualidade defensiva (art. 336 do CPC) —, que ela observe rigorosamente o período e a função efetivamente reconhecidos em sentença, com prazo razoável para cumprimento, sem multa diária e com possibilidade de suprimento pela Secretaria (art. 39, § 1º, da CLT).</w:t>
+          <w:color w:val="FF0000"/>
+          <w:sz w:val="24"/>
+        </w:rPr>
+        <w:t>[CONFERIR SALÁRIO ANOTADO NA CTPS E NA FICHA DE REGISTRO]</w:t>
+      </w:r>
+      <w:r>
+        <w:rPr>
+          <w:rFonts w:ascii="Times New Roman" w:hAnsi="Times New Roman" w:cs="Times New Roman"/>
+          <w:b w:val="0"/>
+          <w:i w:val="0"/>
+          <w:sz w:val="24"/>
+        </w:rPr>
+        <w:t>, sendo o valor da contraprestação fato constitutivo do direito do Autor, que dele não se desincumbiu (art. 818, I, da CLT c/c art. 373, I, do CPC);</w:t>
       </w:r>
     </w:p>
     <w:p/>
@@ -1886,7 +1869,25 @@
           <w:i w:val="0"/>
           <w:sz w:val="24"/>
         </w:rPr>
-        <w:t>2. Do Período Posterior a 09/04/2026 — Prestação Autônoma e Eventual por Empreitada (capítulo 02 da inicial; pedido "II")</w:t>
+        <w:t xml:space="preserve">e) </w:t>
+      </w:r>
+      <w:r>
+        <w:rPr>
+          <w:rFonts w:ascii="Times New Roman" w:hAnsi="Times New Roman" w:cs="Times New Roman"/>
+          <w:b/>
+          <w:i w:val="0"/>
+          <w:sz w:val="24"/>
+        </w:rPr>
+        <w:t>a alegação de ausência de registro</w:t>
+      </w:r>
+      <w:r>
+        <w:rPr>
+          <w:rFonts w:ascii="Times New Roman" w:hAnsi="Times New Roman" w:cs="Times New Roman"/>
+          <w:b w:val="0"/>
+          <w:i w:val="0"/>
+          <w:sz w:val="24"/>
+        </w:rPr>
+        <w:t xml:space="preserve"> — desmentida pela própria CTPS do Reclamante.</w:t>
       </w:r>
     </w:p>
     <w:p/>
@@ -1902,7 +1903,7 @@
           <w:i w:val="0"/>
           <w:sz w:val="24"/>
         </w:rPr>
-        <w:t xml:space="preserve">Encerrado o contrato de experiência em 09/04/2026, </w:t>
+        <w:t xml:space="preserve">Impugna-se, ainda, a jornada narrada na inicial ("de segunda a sexta-feira, além de dois sábados por mês, das 07:30h as 17h, além de realizar sobrejornada habitualmente"): no período contratual o Autor cumpria a jornada contratada, sem sobrejornada habitual. Registre-se a incoerência: embora a inicial afirme a existência de sobrejornada habitual, </w:t>
       </w:r>
       <w:r>
         <w:rPr>
@@ -1911,71 +1912,16 @@
           <w:i w:val="0"/>
           <w:sz w:val="24"/>
         </w:rPr>
-        <w:t>não houve renovação, prorrogação, nem novo contrato de emprego</w:t>
-      </w:r>
-      <w:r>
-        <w:rPr>
-          <w:rFonts w:ascii="Times New Roman" w:hAnsi="Times New Roman" w:cs="Times New Roman"/>
-          <w:b w:val="0"/>
-          <w:i w:val="0"/>
-          <w:sz w:val="24"/>
-        </w:rPr>
-        <w:t xml:space="preserve">. O que houve, a partir de então, foi </w:t>
-      </w:r>
-      <w:r>
-        <w:rPr>
-          <w:rFonts w:ascii="Times New Roman" w:hAnsi="Times New Roman" w:cs="Times New Roman"/>
-          <w:b/>
-          <w:i w:val="0"/>
-          <w:sz w:val="24"/>
-        </w:rPr>
-        <w:t>prestação de serviços autônoma e eventual, mediante empreitada</w:t>
-      </w:r>
-      <w:r>
-        <w:rPr>
-          <w:rFonts w:ascii="Times New Roman" w:hAnsi="Times New Roman" w:cs="Times New Roman"/>
-          <w:b w:val="0"/>
-          <w:i w:val="0"/>
-          <w:sz w:val="24"/>
-        </w:rPr>
-        <w:t xml:space="preserve">, remunerada por tarefa concluída, sem habitualidade, sem exclusividade, sem pessoalidade obrigatória e sem subordinação jurídica — do que é prova o pagamento de </w:t>
-      </w:r>
-      <w:r>
-        <w:rPr>
-          <w:rFonts w:ascii="Times New Roman" w:hAnsi="Times New Roman" w:cs="Times New Roman"/>
-          <w:b/>
-          <w:i w:val="0"/>
-          <w:sz w:val="24"/>
-        </w:rPr>
-        <w:t>R$ 700,00, efetuado em 19/05/2026 (doc. anexo)</w:t>
-      </w:r>
-      <w:r>
-        <w:rPr>
-          <w:rFonts w:ascii="Times New Roman" w:hAnsi="Times New Roman" w:cs="Times New Roman"/>
-          <w:b w:val="0"/>
-          <w:i w:val="0"/>
-          <w:sz w:val="24"/>
-        </w:rPr>
-        <w:t xml:space="preserve"> </w:t>
-      </w:r>
-      <w:r>
-        <w:rPr>
-          <w:rFonts w:ascii="Times New Roman" w:hAnsi="Times New Roman" w:cs="Times New Roman"/>
-          <w:b/>
-          <w:i w:val="0"/>
-          <w:color w:val="FF0000"/>
-          <w:sz w:val="24"/>
-        </w:rPr>
-        <w:t>[doc. anexo — CONFIRMAR JUNTADA DO COMPROVANTE E DO RECIBO/AJUSTE DE EMPREITADA]</w:t>
-      </w:r>
-      <w:r>
-        <w:rPr>
-          <w:rFonts w:ascii="Times New Roman" w:hAnsi="Times New Roman" w:cs="Times New Roman"/>
-          <w:b w:val="0"/>
-          <w:i w:val="0"/>
-          <w:sz w:val="24"/>
-        </w:rPr>
-        <w:t>.</w:t>
+        <w:t>nenhum pedido de horas extras foi formulado</w:t>
+      </w:r>
+      <w:r>
+        <w:rPr>
+          <w:rFonts w:ascii="Times New Roman" w:hAnsi="Times New Roman" w:cs="Times New Roman"/>
+          <w:b w:val="0"/>
+          <w:i w:val="0"/>
+          <w:sz w:val="24"/>
+        </w:rPr>
+        <w:t xml:space="preserve"> — nem no capítulo 03, nem no rol de pedidos —, o que revela que a narrativa de jornada foi inserida apenas para emprestar aparência de subordinação, e não para amparar pretensão real.</w:t>
       </w:r>
     </w:p>
     <w:p/>
@@ -1987,11 +1933,74 @@
       <w:r>
         <w:rPr>
           <w:rFonts w:ascii="Times New Roman" w:hAnsi="Times New Roman" w:cs="Times New Roman"/>
-          <w:b w:val="0"/>
-          <w:i w:val="0"/>
-          <w:sz w:val="24"/>
-        </w:rPr>
-        <w:t>O próprio pagamento desmente a narrativa da inicial em três pontos objetivos:</w:t>
+          <w:b/>
+          <w:i w:val="0"/>
+          <w:sz w:val="24"/>
+        </w:rPr>
+        <w:t>Quanto ao pedido "II"</w:t>
+      </w:r>
+      <w:r>
+        <w:rPr>
+          <w:rFonts w:ascii="Times New Roman" w:hAnsi="Times New Roman" w:cs="Times New Roman"/>
+          <w:b w:val="0"/>
+          <w:i w:val="0"/>
+          <w:sz w:val="24"/>
+        </w:rPr>
+        <w:t xml:space="preserve">, o reconhecimento de vínculo e a anotação da CTPS estão </w:t>
+      </w:r>
+      <w:r>
+        <w:rPr>
+          <w:rFonts w:ascii="Times New Roman" w:hAnsi="Times New Roman" w:cs="Times New Roman"/>
+          <w:b/>
+          <w:i w:val="0"/>
+          <w:sz w:val="24"/>
+        </w:rPr>
+        <w:t>prejudicados</w:t>
+      </w:r>
+      <w:r>
+        <w:rPr>
+          <w:rFonts w:ascii="Times New Roman" w:hAnsi="Times New Roman" w:cs="Times New Roman"/>
+          <w:b w:val="0"/>
+          <w:i w:val="0"/>
+          <w:sz w:val="24"/>
+        </w:rPr>
+        <w:t xml:space="preserve"> no período de 11/03/2026 a 09/04/2026, porque a anotação </w:t>
+      </w:r>
+      <w:r>
+        <w:rPr>
+          <w:rFonts w:ascii="Times New Roman" w:hAnsi="Times New Roman" w:cs="Times New Roman"/>
+          <w:b/>
+          <w:i w:val="0"/>
+          <w:sz w:val="24"/>
+        </w:rPr>
+        <w:t>já existe</w:t>
+      </w:r>
+      <w:r>
+        <w:rPr>
+          <w:rFonts w:ascii="Times New Roman" w:hAnsi="Times New Roman" w:cs="Times New Roman"/>
+          <w:b w:val="0"/>
+          <w:i w:val="0"/>
+          <w:sz w:val="24"/>
+        </w:rPr>
+        <w:t xml:space="preserve"> e é regular; e são </w:t>
+      </w:r>
+      <w:r>
+        <w:rPr>
+          <w:rFonts w:ascii="Times New Roman" w:hAnsi="Times New Roman" w:cs="Times New Roman"/>
+          <w:b/>
+          <w:i w:val="0"/>
+          <w:sz w:val="24"/>
+        </w:rPr>
+        <w:t>improcedentes</w:t>
+      </w:r>
+      <w:r>
+        <w:rPr>
+          <w:rFonts w:ascii="Times New Roman" w:hAnsi="Times New Roman" w:cs="Times New Roman"/>
+          <w:b w:val="0"/>
+          <w:i w:val="0"/>
+          <w:sz w:val="24"/>
+        </w:rPr>
+        <w:t xml:space="preserve"> quanto ao período posterior, pelas razões do item III.2. Subsidiariamente, acaso este Douto Juízo entenda de determinar qualquer retificação — o que se admite estritamente pelo princípio da eventualidade defensiva (art. 336 do CPC) —, que ela observe rigorosamente o período e a função efetivamente reconhecidos em sentença, com prazo razoável para cumprimento, sem multa diária e com possibilidade de suprimento pela Secretaria (art. 39, § 1º, da CLT).</w:t>
       </w:r>
     </w:p>
     <w:p/>
@@ -2007,25 +2016,7 @@
           <w:i w:val="0"/>
           <w:sz w:val="24"/>
         </w:rPr>
-        <w:t xml:space="preserve">a) </w:t>
-      </w:r>
-      <w:r>
-        <w:rPr>
-          <w:rFonts w:ascii="Times New Roman" w:hAnsi="Times New Roman" w:cs="Times New Roman"/>
-          <w:b/>
-          <w:i w:val="0"/>
-          <w:sz w:val="24"/>
-        </w:rPr>
-        <w:t>o valor</w:t>
-      </w:r>
-      <w:r>
-        <w:rPr>
-          <w:rFonts w:ascii="Times New Roman" w:hAnsi="Times New Roman" w:cs="Times New Roman"/>
-          <w:b w:val="0"/>
-          <w:i w:val="0"/>
-          <w:sz w:val="24"/>
-        </w:rPr>
-        <w:t xml:space="preserve"> — R$ 700,00 por serviço concluído é incompatível com a alegação de salário mensal fixo de R$ 2.000,00 continuado até 15/05/2026;</w:t>
+        <w:t>2. Do Período Posterior a 09/04/2026 — Prestação Autônoma e Eventual por Empreitada (capítulo 02 da inicial; pedido "II")</w:t>
       </w:r>
     </w:p>
     <w:p/>
@@ -2041,7 +2032,7 @@
           <w:i w:val="0"/>
           <w:sz w:val="24"/>
         </w:rPr>
-        <w:t xml:space="preserve">b) </w:t>
+        <w:t xml:space="preserve">Encerrado o contrato de experiência em 09/04/2026, </w:t>
       </w:r>
       <w:r>
         <w:rPr>
@@ -2050,16 +2041,16 @@
           <w:i w:val="0"/>
           <w:sz w:val="24"/>
         </w:rPr>
-        <w:t>a data</w:t>
-      </w:r>
-      <w:r>
-        <w:rPr>
-          <w:rFonts w:ascii="Times New Roman" w:hAnsi="Times New Roman" w:cs="Times New Roman"/>
-          <w:b w:val="0"/>
-          <w:i w:val="0"/>
-          <w:sz w:val="24"/>
-        </w:rPr>
-        <w:t xml:space="preserve"> — o pagamento ocorreu em </w:t>
+        <w:t>não houve renovação, prorrogação, nem novo contrato de emprego</w:t>
+      </w:r>
+      <w:r>
+        <w:rPr>
+          <w:rFonts w:ascii="Times New Roman" w:hAnsi="Times New Roman" w:cs="Times New Roman"/>
+          <w:b w:val="0"/>
+          <w:i w:val="0"/>
+          <w:sz w:val="24"/>
+        </w:rPr>
+        <w:t xml:space="preserve">. O que houve, a partir de então, foi </w:t>
       </w:r>
       <w:r>
         <w:rPr>
@@ -2068,16 +2059,16 @@
           <w:i w:val="0"/>
           <w:sz w:val="24"/>
         </w:rPr>
-        <w:t>19/05/2026</w:t>
-      </w:r>
-      <w:r>
-        <w:rPr>
-          <w:rFonts w:ascii="Times New Roman" w:hAnsi="Times New Roman" w:cs="Times New Roman"/>
-          <w:b w:val="0"/>
-          <w:i w:val="0"/>
-          <w:sz w:val="24"/>
-        </w:rPr>
-        <w:t xml:space="preserve">, isto é, </w:t>
+        <w:t>prestação de serviços autônoma e eventual, mediante empreitada</w:t>
+      </w:r>
+      <w:r>
+        <w:rPr>
+          <w:rFonts w:ascii="Times New Roman" w:hAnsi="Times New Roman" w:cs="Times New Roman"/>
+          <w:b w:val="0"/>
+          <w:i w:val="0"/>
+          <w:sz w:val="24"/>
+        </w:rPr>
+        <w:t xml:space="preserve">, remunerada por tarefa concluída, sem habitualidade, sem exclusividade, sem pessoalidade obrigatória e sem subordinação jurídica — do que é prova o pagamento de </w:t>
       </w:r>
       <w:r>
         <w:rPr>
@@ -2086,34 +2077,35 @@
           <w:i w:val="0"/>
           <w:sz w:val="24"/>
         </w:rPr>
-        <w:t>depois</w:t>
-      </w:r>
-      <w:r>
-        <w:rPr>
-          <w:rFonts w:ascii="Times New Roman" w:hAnsi="Times New Roman" w:cs="Times New Roman"/>
-          <w:b w:val="0"/>
-          <w:i w:val="0"/>
-          <w:sz w:val="24"/>
-        </w:rPr>
-        <w:t xml:space="preserve"> do dia em que o Autor afirma ter sido dispensado (15/05/2026), o que só se explica pela quitação de </w:t>
+        <w:t>R$ 700,00, efetuado em 19/05/2026 (doc. anexo)</w:t>
+      </w:r>
+      <w:r>
+        <w:rPr>
+          <w:rFonts w:ascii="Times New Roman" w:hAnsi="Times New Roman" w:cs="Times New Roman"/>
+          <w:b w:val="0"/>
+          <w:i w:val="0"/>
+          <w:sz w:val="24"/>
+        </w:rPr>
+        <w:t xml:space="preserve"> </w:t>
       </w:r>
       <w:r>
         <w:rPr>
           <w:rFonts w:ascii="Times New Roman" w:hAnsi="Times New Roman" w:cs="Times New Roman"/>
           <w:b/>
           <w:i w:val="0"/>
-          <w:sz w:val="24"/>
-        </w:rPr>
-        <w:t>tarefa concluída</w:t>
-      </w:r>
-      <w:r>
-        <w:rPr>
-          <w:rFonts w:ascii="Times New Roman" w:hAnsi="Times New Roman" w:cs="Times New Roman"/>
-          <w:b w:val="0"/>
-          <w:i w:val="0"/>
-          <w:sz w:val="24"/>
-        </w:rPr>
-        <w:t>, e não por contraprestação de contrato de emprego em curso;</w:t>
+          <w:color w:val="FF0000"/>
+          <w:sz w:val="24"/>
+        </w:rPr>
+        <w:t>[doc. anexo — CONFIRMAR JUNTADA DO COMPROVANTE E DO RECIBO/AJUSTE DE EMPREITADA]</w:t>
+      </w:r>
+      <w:r>
+        <w:rPr>
+          <w:rFonts w:ascii="Times New Roman" w:hAnsi="Times New Roman" w:cs="Times New Roman"/>
+          <w:b w:val="0"/>
+          <w:i w:val="0"/>
+          <w:sz w:val="24"/>
+        </w:rPr>
+        <w:t>.</w:t>
       </w:r>
     </w:p>
     <w:p/>
@@ -2129,6 +2121,144 @@
           <w:i w:val="0"/>
           <w:sz w:val="24"/>
         </w:rPr>
+        <w:t>O próprio pagamento desmente a narrativa da inicial em três pontos objetivos:</w:t>
+      </w:r>
+    </w:p>
+    <w:p/>
+    <w:p>
+      <w:pPr>
+        <w:ind w:firstLine="850"/>
+        <w:jc w:val="both"/>
+      </w:pPr>
+      <w:r>
+        <w:rPr>
+          <w:rFonts w:ascii="Times New Roman" w:hAnsi="Times New Roman" w:cs="Times New Roman"/>
+          <w:b w:val="0"/>
+          <w:i w:val="0"/>
+          <w:sz w:val="24"/>
+        </w:rPr>
+        <w:t xml:space="preserve">a) </w:t>
+      </w:r>
+      <w:r>
+        <w:rPr>
+          <w:rFonts w:ascii="Times New Roman" w:hAnsi="Times New Roman" w:cs="Times New Roman"/>
+          <w:b/>
+          <w:i w:val="0"/>
+          <w:sz w:val="24"/>
+        </w:rPr>
+        <w:t>o valor</w:t>
+      </w:r>
+      <w:r>
+        <w:rPr>
+          <w:rFonts w:ascii="Times New Roman" w:hAnsi="Times New Roman" w:cs="Times New Roman"/>
+          <w:b w:val="0"/>
+          <w:i w:val="0"/>
+          <w:sz w:val="24"/>
+        </w:rPr>
+        <w:t xml:space="preserve"> — R$ 700,00 por serviço concluído é incompatível com a alegação de salário mensal fixo de R$ 2.000,00 continuado até 15/05/2026;</w:t>
+      </w:r>
+    </w:p>
+    <w:p/>
+    <w:p>
+      <w:pPr>
+        <w:ind w:firstLine="850"/>
+        <w:jc w:val="both"/>
+      </w:pPr>
+      <w:r>
+        <w:rPr>
+          <w:rFonts w:ascii="Times New Roman" w:hAnsi="Times New Roman" w:cs="Times New Roman"/>
+          <w:b w:val="0"/>
+          <w:i w:val="0"/>
+          <w:sz w:val="24"/>
+        </w:rPr>
+        <w:t xml:space="preserve">b) </w:t>
+      </w:r>
+      <w:r>
+        <w:rPr>
+          <w:rFonts w:ascii="Times New Roman" w:hAnsi="Times New Roman" w:cs="Times New Roman"/>
+          <w:b/>
+          <w:i w:val="0"/>
+          <w:sz w:val="24"/>
+        </w:rPr>
+        <w:t>a data</w:t>
+      </w:r>
+      <w:r>
+        <w:rPr>
+          <w:rFonts w:ascii="Times New Roman" w:hAnsi="Times New Roman" w:cs="Times New Roman"/>
+          <w:b w:val="0"/>
+          <w:i w:val="0"/>
+          <w:sz w:val="24"/>
+        </w:rPr>
+        <w:t xml:space="preserve"> — o pagamento ocorreu em </w:t>
+      </w:r>
+      <w:r>
+        <w:rPr>
+          <w:rFonts w:ascii="Times New Roman" w:hAnsi="Times New Roman" w:cs="Times New Roman"/>
+          <w:b/>
+          <w:i w:val="0"/>
+          <w:sz w:val="24"/>
+        </w:rPr>
+        <w:t>19/05/2026</w:t>
+      </w:r>
+      <w:r>
+        <w:rPr>
+          <w:rFonts w:ascii="Times New Roman" w:hAnsi="Times New Roman" w:cs="Times New Roman"/>
+          <w:b w:val="0"/>
+          <w:i w:val="0"/>
+          <w:sz w:val="24"/>
+        </w:rPr>
+        <w:t xml:space="preserve">, isto é, </w:t>
+      </w:r>
+      <w:r>
+        <w:rPr>
+          <w:rFonts w:ascii="Times New Roman" w:hAnsi="Times New Roman" w:cs="Times New Roman"/>
+          <w:b/>
+          <w:i w:val="0"/>
+          <w:sz w:val="24"/>
+        </w:rPr>
+        <w:t>depois</w:t>
+      </w:r>
+      <w:r>
+        <w:rPr>
+          <w:rFonts w:ascii="Times New Roman" w:hAnsi="Times New Roman" w:cs="Times New Roman"/>
+          <w:b w:val="0"/>
+          <w:i w:val="0"/>
+          <w:sz w:val="24"/>
+        </w:rPr>
+        <w:t xml:space="preserve"> do dia em que o Autor afirma ter sido dispensado (15/05/2026), o que só se explica pela quitação de </w:t>
+      </w:r>
+      <w:r>
+        <w:rPr>
+          <w:rFonts w:ascii="Times New Roman" w:hAnsi="Times New Roman" w:cs="Times New Roman"/>
+          <w:b/>
+          <w:i w:val="0"/>
+          <w:sz w:val="24"/>
+        </w:rPr>
+        <w:t>tarefa concluída</w:t>
+      </w:r>
+      <w:r>
+        <w:rPr>
+          <w:rFonts w:ascii="Times New Roman" w:hAnsi="Times New Roman" w:cs="Times New Roman"/>
+          <w:b w:val="0"/>
+          <w:i w:val="0"/>
+          <w:sz w:val="24"/>
+        </w:rPr>
+        <w:t>, e não por contraprestação de contrato de emprego em curso;</w:t>
+      </w:r>
+    </w:p>
+    <w:p/>
+    <w:p>
+      <w:pPr>
+        <w:ind w:firstLine="850"/>
+        <w:jc w:val="both"/>
+      </w:pPr>
+      <w:r>
+        <w:rPr>
+          <w:rFonts w:ascii="Times New Roman" w:hAnsi="Times New Roman" w:cs="Times New Roman"/>
+          <w:b w:val="0"/>
+          <w:i w:val="0"/>
+          <w:sz w:val="24"/>
+        </w:rPr>
         <w:t xml:space="preserve">c) </w:t>
       </w:r>
       <w:r>
@@ -2148,6 +2278,40 @@
           <w:sz w:val="24"/>
         </w:rPr>
         <w:t xml:space="preserve"> — trata-se de pagamento único e avulso no período, e não de remuneração mensal sucessiva.</w:t>
+      </w:r>
+    </w:p>
+    <w:p/>
+    <w:p>
+      <w:pPr>
+        <w:ind w:firstLine="850"/>
+        <w:jc w:val="both"/>
+      </w:pPr>
+      <w:r>
+        <w:rPr>
+          <w:rFonts w:ascii="Times New Roman" w:hAnsi="Times New Roman" w:cs="Times New Roman"/>
+          <w:b w:val="0"/>
+          <w:i w:val="0"/>
+          <w:sz w:val="24"/>
+        </w:rPr>
+        <w:t xml:space="preserve">Registre-se que esse pagamento </w:t>
+      </w:r>
+      <w:r>
+        <w:rPr>
+          <w:rFonts w:ascii="Times New Roman" w:hAnsi="Times New Roman" w:cs="Times New Roman"/>
+          <w:b/>
+          <w:i w:val="0"/>
+          <w:sz w:val="24"/>
+        </w:rPr>
+        <w:t>não se confunde</w:t>
+      </w:r>
+      <w:r>
+        <w:rPr>
+          <w:rFonts w:ascii="Times New Roman" w:hAnsi="Times New Roman" w:cs="Times New Roman"/>
+          <w:b w:val="0"/>
+          <w:i w:val="0"/>
+          <w:sz w:val="24"/>
+        </w:rPr>
+        <w:t xml:space="preserve"> com o comprovante de PIX juntado pelo Autor (ID 59a6bef), operação de terceiro — Sr. Willians da Silva Oliveira — na qual a Reclamada não figura, conforme item II.1 desta contestação.</w:t>
       </w:r>
     </w:p>
     <w:p/>

</xml_diff>